<commit_message>
vault backup: 2026-10-18 11:14:29
</commit_message>
<xml_diff>
--- a/Visa/801 - Permanent Residency/Prepared Documents/Form 80 Attachment - Kristina Aleksandrova Warren - Review Draft - WaKr-2631-801-3.docx
+++ b/Visa/801 - Permanent Residency/Prepared Documents/Form 80 Attachment - Kristina Aleksandrova Warren - Review Draft - WaKr-2631-801-3.docx
@@ -339,20 +339,6 @@
         <w:tc>
           <w:tcPr>
             <w:tcW w:w="1719" w:type="dxa"/>
-          </w:tcPr>
-          <w:p>
-            <w:r>
-              <w:rPr>
-                <w:rFonts w:ascii="Aptos" w:hAnsi="Aptos"/>
-                <w:sz w:val="17"/>
-              </w:rPr>
-              <w:t>21.06.2024</w:t>
-            </w:r>
-          </w:p>
-        </w:tc>
-        <w:tc>
-          <w:tcPr>
-            <w:tcW w:w="1719" w:type="dxa"/>
             <w:shd w:fill="FFF2CC"/>
           </w:tcPr>
           <w:p>
@@ -368,7 +354,7 @@
         </w:tc>
         <w:tc>
           <w:tcPr>
-            <w:tcW w:w="8251" w:type="dxa"/>
+            <w:tcW w:w="1719" w:type="dxa"/>
           </w:tcPr>
           <w:p>
             <w:r>
@@ -376,7 +362,21 @@
                 <w:rFonts w:ascii="Aptos" w:hAnsi="Aptos"/>
                 <w:sz w:val="17"/>
               </w:rPr>
-              <w:t>9 Woollahra Court, Varsity Lakes, QLD 4227</w:t>
+              <w:t>10.11.2024</w:t>
+            </w:r>
+          </w:p>
+        </w:tc>
+        <w:tc>
+          <w:tcPr>
+            <w:tcW w:w="8251" w:type="dxa"/>
+          </w:tcPr>
+          <w:p>
+            <w:r>
+              <w:rPr>
+                <w:rFonts w:ascii="Aptos" w:hAnsi="Aptos"/>
+                <w:sz w:val="17"/>
+              </w:rPr>
+              <w:t>12 Millet Place, Upper Coomera, QLD 4209</w:t>
             </w:r>
           </w:p>
         </w:tc>
@@ -402,6 +402,20 @@
         <w:tc>
           <w:tcPr>
             <w:tcW w:w="1719" w:type="dxa"/>
+          </w:tcPr>
+          <w:p>
+            <w:r>
+              <w:rPr>
+                <w:rFonts w:ascii="Aptos" w:hAnsi="Aptos"/>
+                <w:sz w:val="17"/>
+              </w:rPr>
+              <w:t>21.06.2024</w:t>
+            </w:r>
+          </w:p>
+        </w:tc>
+        <w:tc>
+          <w:tcPr>
+            <w:tcW w:w="1719" w:type="dxa"/>
             <w:shd w:fill="FFF2CC"/>
           </w:tcPr>
           <w:p>
@@ -417,7 +431,7 @@
         </w:tc>
         <w:tc>
           <w:tcPr>
-            <w:tcW w:w="1719" w:type="dxa"/>
+            <w:tcW w:w="8251" w:type="dxa"/>
           </w:tcPr>
           <w:p>
             <w:r>
@@ -425,21 +439,7 @@
                 <w:rFonts w:ascii="Aptos" w:hAnsi="Aptos"/>
                 <w:sz w:val="17"/>
               </w:rPr>
-              <w:t>10.11.2024</w:t>
-            </w:r>
-          </w:p>
-        </w:tc>
-        <w:tc>
-          <w:tcPr>
-            <w:tcW w:w="8251" w:type="dxa"/>
-          </w:tcPr>
-          <w:p>
-            <w:r>
-              <w:rPr>
-                <w:rFonts w:ascii="Aptos" w:hAnsi="Aptos"/>
-                <w:sz w:val="17"/>
-              </w:rPr>
-              <w:t>12 Millet Place, Upper Coomera, QLD 4209</w:t>
+              <w:t>9 Woollahra Court, Varsity Lakes, QLD 4227</w:t>
             </w:r>
           </w:p>
         </w:tc>

</xml_diff>